<commit_message>
Actualización del proyecto en la rama Jair-Arias
</commit_message>
<xml_diff>
--- a/EVIDENCIA PROGRAMACIÓN ORIENTADA A OBJETOS CON PHP JAIR.docx
+++ b/EVIDENCIA PROGRAMACIÓN ORIENTADA A OBJETOS CON PHP JAIR.docx
@@ -288,7 +288,7 @@
           <w:noProof/>
         </w:rPr>
         <w:drawing>
-          <wp:anchor distT="0" distB="0" distL="114300" distR="114300" simplePos="0" relativeHeight="251658240" behindDoc="1" locked="0" layoutInCell="1" allowOverlap="1" wp14:anchorId="5DAE86D7" wp14:editId="2BE58D85">
+          <wp:anchor distT="0" distB="0" distL="114300" distR="114300" simplePos="0" relativeHeight="251658240" behindDoc="1" locked="0" layoutInCell="1" allowOverlap="1" wp14:anchorId="5DAE86D7" wp14:editId="12B73BF6">
             <wp:simplePos x="0" y="0"/>
             <wp:positionH relativeFrom="margin">
               <wp:align>right</wp:align>
@@ -384,19 +384,7 @@
           <w:rPr>
             <w:rStyle w:val="Hipervnculo"/>
           </w:rPr>
-          <w:t>https://github.com/Jair-Arias/Clase</w:t>
-        </w:r>
-        <w:r>
-          <w:rPr>
-            <w:rStyle w:val="Hipervnculo"/>
-          </w:rPr>
-          <w:t>-</w:t>
-        </w:r>
-        <w:r>
-          <w:rPr>
-            <w:rStyle w:val="Hipervnculo"/>
-          </w:rPr>
-          <w:t>Nestor-.git</w:t>
+          <w:t>https://github.com/Jair-Arias/CLASE-NESTOR.git</w:t>
         </w:r>
       </w:hyperlink>
     </w:p>
@@ -4049,6 +4037,7 @@
   <w:style w:type="character" w:default="1" w:styleId="Fuentedeprrafopredeter">
     <w:name w:val="Default Paragraph Font"/>
     <w:uiPriority w:val="1"/>
+    <w:semiHidden/>
     <w:unhideWhenUsed/>
   </w:style>
   <w:style w:type="table" w:default="1" w:styleId="Tablanormal">
@@ -4617,28 +4606,28 @@
 </file>
 
 <file path=customXml/item1.xml><?xml version="1.0" encoding="utf-8"?>
+<b:Sources xmlns:b="http://schemas.openxmlformats.org/officeDocument/2006/bibliography" xmlns="http://schemas.openxmlformats.org/officeDocument/2006/bibliography" SelectedStyle="\APASixthEditionOfficeOnline.xsl" StyleName="APA" Version="6"/>
+</file>
+
+<file path=customXml/item2.xml><?xml version="1.0" encoding="utf-8"?>
 <go:gDocsCustomXmlDataStorage xmlns:go="http://customooxmlschemas.google.com/" xmlns:r="http://schemas.openxmlformats.org/officeDocument/2006/relationships" uri="GoogleDocsCustomDataVersion2">
   <go:docsCustomData xmlns:go="http://customooxmlschemas.google.com/" roundtripDataSignature="AMtx7mgjIi8mV/ll7RC7RGGXrONUlBLqNw==">CgMxLjAyDmgubjZ6NWc0dTI2b2kzMg5oLm9mYTFhemt2NXJhbTIOaC45YXdpd2prZWp5YmMyDmguaWwwMTZiMnQzYXMzMg5oLjY3eXl2dTdkdmFuYTgAciExbk1zQVJYN1ZyVTR2b0Joc1hRSmY1enRLM2JXWVhrZDU=</go:docsCustomData>
 </go:gDocsCustomXmlDataStorage>
 </file>
 
-<file path=customXml/item2.xml><?xml version="1.0" encoding="utf-8"?>
-<b:Sources xmlns:b="http://schemas.openxmlformats.org/officeDocument/2006/bibliography" xmlns="http://schemas.openxmlformats.org/officeDocument/2006/bibliography" SelectedStyle="\APASixthEditionOfficeOnline.xsl" StyleName="APA" Version="6"/>
+<file path=customXml/itemProps1.xml><?xml version="1.0" encoding="utf-8"?>
+<ds:datastoreItem xmlns:ds="http://schemas.openxmlformats.org/officeDocument/2006/customXml" ds:itemID="{2EC9EC03-D02E-4056-A37D-CA6E9DCD92DB}">
+  <ds:schemaRefs>
+    <ds:schemaRef ds:uri="http://schemas.openxmlformats.org/officeDocument/2006/bibliography"/>
+  </ds:schemaRefs>
+</ds:datastoreItem>
 </file>
 
-<file path=customXml/itemProps1.xml><?xml version="1.0" encoding="utf-8"?>
+<file path=customXml/itemProps2.xml><?xml version="1.0" encoding="utf-8"?>
 <ds:datastoreItem xmlns:ds="http://schemas.openxmlformats.org/officeDocument/2006/customXml" ds:itemID="{11111111-1234-1234-1234-123412341234}">
   <ds:schemaRefs>
     <ds:schemaRef ds:uri="http://customooxmlschemas.google.com/"/>
     <ds:schemaRef ds:uri="http://schemas.openxmlformats.org/officeDocument/2006/relationships"/>
   </ds:schemaRefs>
 </ds:datastoreItem>
-</file>
-
-<file path=customXml/itemProps2.xml><?xml version="1.0" encoding="utf-8"?>
-<ds:datastoreItem xmlns:ds="http://schemas.openxmlformats.org/officeDocument/2006/customXml" ds:itemID="{2EC9EC03-D02E-4056-A37D-CA6E9DCD92DB}">
-  <ds:schemaRefs>
-    <ds:schemaRef ds:uri="http://schemas.openxmlformats.org/officeDocument/2006/bibliography"/>
-  </ds:schemaRefs>
-</ds:datastoreItem>
 </file>
</xml_diff>